<commit_message>
GE unit 4 lesson plans: relative-position tables in the teacher's TikZ model
Co-Authored-By: Claude Opus 5.5 <noreply@anthropic.com>
Claude-Session: https://claude.ai/code/session_015WVgZKTbSWpZTjn6aZsqC9
</commit_message>
<xml_diff>
--- a/documents/3as_ge/modhakirat/modhakira_wahda4_3as_ge.docx
+++ b/documents/3as_ge/modhakirat/modhakira_wahda4_3as_ge.docx
@@ -17945,7 +17945,7 @@
               </w:rPr>
               <w:drawing>
                 <wp:inline>
-                  <wp:extent cx="4038656" cy="1006771"/>
+                  <wp:extent cx="4038656" cy="1511449"/>
                   <wp:docPr id="4" name="Picture 4"/>
                   <wp:cNvGraphicFramePr>
                     <a:graphicFrameLocks noChangeAspect="1"/>
@@ -17954,7 +17954,7 @@
                     <a:graphicData uri="http://schemas.openxmlformats.org/drawingml/2006/picture">
                       <pic:pic>
                         <pic:nvPicPr>
-                          <pic:cNvPr id="0" name="5a40ed90495f6c48.png"/>
+                          <pic:cNvPr id="0" name="5f1f291988b60ae1.png"/>
                           <pic:cNvPicPr/>
                         </pic:nvPicPr>
                         <pic:blipFill>
@@ -17966,7 +17966,7 @@
                         <pic:spPr>
                           <a:xfrm>
                             <a:off x="0" y="0"/>
-                            <a:ext cx="4038656" cy="1006771"/>
+                            <a:ext cx="4038656" cy="1511449"/>
                           </a:xfrm>
                           <a:prstGeom prst="rect"/>
                         </pic:spPr>
@@ -19223,7 +19223,7 @@
               </w:rPr>
               <w:drawing>
                 <wp:inline>
-                  <wp:extent cx="4038656" cy="1077801"/>
+                  <wp:extent cx="4038656" cy="1509930"/>
                   <wp:docPr id="6" name="Picture 6"/>
                   <wp:cNvGraphicFramePr>
                     <a:graphicFrameLocks noChangeAspect="1"/>
@@ -19232,7 +19232,7 @@
                     <a:graphicData uri="http://schemas.openxmlformats.org/drawingml/2006/picture">
                       <pic:pic>
                         <pic:nvPicPr>
-                          <pic:cNvPr id="0" name="22dcea62b7f641b8.png"/>
+                          <pic:cNvPr id="0" name="e05832ad8fa737b6.png"/>
                           <pic:cNvPicPr/>
                         </pic:nvPicPr>
                         <pic:blipFill>
@@ -19244,7 +19244,7 @@
                         <pic:spPr>
                           <a:xfrm>
                             <a:off x="0" y="0"/>
-                            <a:ext cx="4038656" cy="1077801"/>
+                            <a:ext cx="4038656" cy="1509930"/>
                           </a:xfrm>
                           <a:prstGeom prst="rect"/>
                         </pic:spPr>
@@ -21660,7 +21660,7 @@
               </w:rPr>
               <w:drawing>
                 <wp:inline>
-                  <wp:extent cx="4038656" cy="912621"/>
+                  <wp:extent cx="4038656" cy="1509930"/>
                   <wp:docPr id="8" name="Picture 8"/>
                   <wp:cNvGraphicFramePr>
                     <a:graphicFrameLocks noChangeAspect="1"/>
@@ -21669,7 +21669,7 @@
                     <a:graphicData uri="http://schemas.openxmlformats.org/drawingml/2006/picture">
                       <pic:pic>
                         <pic:nvPicPr>
-                          <pic:cNvPr id="0" name="856149f0080230b8.png"/>
+                          <pic:cNvPr id="0" name="741db45c6b9da2d5.png"/>
                           <pic:cNvPicPr/>
                         </pic:nvPicPr>
                         <pic:blipFill>
@@ -21681,7 +21681,7 @@
                         <pic:spPr>
                           <a:xfrm>
                             <a:off x="0" y="0"/>
-                            <a:ext cx="4038656" cy="912621"/>
+                            <a:ext cx="4038656" cy="1509930"/>
                           </a:xfrm>
                           <a:prstGeom prst="rect"/>
                         </pic:spPr>
@@ -22506,7 +22506,137 @@
               <w:rPr>
                 <w:rtl/>
               </w:rPr>
-              <w:t xml:space="preserve">الوضع النسبي:</w:t>
+              <w:t xml:space="preserve">الوضع النسبي:نسمي</w:t>
+            </w:r>
+            <w:r>
+              <w:rPr>
+                <w:rtl/>
+              </w:rPr>
+              <w:t xml:space="preserve"> </w:t>
+            </w:r>
+            <m:oMath>
+              <m:d>
+                <m:dPr>
+                  <m:begChr m:val="("/>
+                  <m:endChr m:val=")"/>
+                  <m:sepChr m:val=""/>
+                  <m:grow/>
+                </m:dPr>
+                <m:e>
+                  <m:r>
+                    <m:t>Δ</m:t>
+                  </m:r>
+                </m:e>
+              </m:d>
+            </m:oMath>
+            <w:r>
+              <w:rPr>
+                <w:rtl/>
+              </w:rPr>
+              <w:t xml:space="preserve"> </w:t>
+            </w:r>
+            <w:r>
+              <w:rPr>
+                <w:rtl/>
+              </w:rPr>
+              <w:t xml:space="preserve">المستقيم</w:t>
+            </w:r>
+            <w:r>
+              <w:rPr>
+                <w:rtl/>
+              </w:rPr>
+              <w:t xml:space="preserve"> </w:t>
+            </w:r>
+            <m:oMath>
+              <m:r>
+                <m:t>y</m:t>
+              </m:r>
+              <m:r>
+                <m:rPr>
+                  <m:sty m:val="p"/>
+                </m:rPr>
+                <m:t>=</m:t>
+              </m:r>
+              <m:r>
+                <m:t>2</m:t>
+              </m:r>
+              <m:r>
+                <m:t>x</m:t>
+              </m:r>
+            </m:oMath>
+            <w:r>
+              <w:rPr>
+                <w:rtl/>
+              </w:rPr>
+              <w:t xml:space="preserve"> </w:t>
+            </w:r>
+            <w:r>
+              <w:rPr>
+                <w:rtl/>
+              </w:rPr>
+              <w:t xml:space="preserve">و</w:t>
+            </w:r>
+            <m:oMath>
+              <m:d>
+                <m:dPr>
+                  <m:begChr m:val="("/>
+                  <m:endChr m:val=")"/>
+                  <m:sepChr m:val=""/>
+                  <m:grow/>
+                </m:dPr>
+                <m:e>
+                  <m:r>
+                    <m:t>C</m:t>
+                  </m:r>
+                </m:e>
+              </m:d>
+            </m:oMath>
+            <w:r>
+              <w:rPr>
+                <w:rtl/>
+              </w:rPr>
+              <w:t xml:space="preserve"> </w:t>
+            </w:r>
+            <w:r>
+              <w:rPr>
+                <w:rtl/>
+              </w:rPr>
+              <w:t xml:space="preserve">المنحنى</w:t>
+            </w:r>
+            <w:r>
+              <w:rPr>
+                <w:rtl/>
+              </w:rPr>
+              <w:t xml:space="preserve"> </w:t>
+            </w:r>
+            <m:oMath>
+              <m:r>
+                <m:t>y</m:t>
+              </m:r>
+              <m:r>
+                <m:rPr>
+                  <m:sty m:val="p"/>
+                </m:rPr>
+                <m:t>=</m:t>
+              </m:r>
+              <m:sSup>
+                <m:e>
+                  <m:r>
+                    <m:t>x</m:t>
+                  </m:r>
+                </m:e>
+                <m:sup>
+                  <m:r>
+                    <m:t>2</m:t>
+                  </m:r>
+                </m:sup>
+              </m:sSup>
+            </m:oMath>
+            <w:r>
+              <w:rPr>
+                <w:rtl/>
+              </w:rPr>
+              <w:t xml:space="preserve">:</w:t>
             </w:r>
           </w:p>
           <w:p>
@@ -22520,7 +22650,7 @@
               </w:rPr>
               <w:drawing>
                 <wp:inline>
-                  <wp:extent cx="4038656" cy="871326"/>
+                  <wp:extent cx="4038656" cy="1509930"/>
                   <wp:docPr id="10" name="Picture 10"/>
                   <wp:cNvGraphicFramePr>
                     <a:graphicFrameLocks noChangeAspect="1"/>
@@ -22529,7 +22659,7 @@
                     <a:graphicData uri="http://schemas.openxmlformats.org/drawingml/2006/picture">
                       <pic:pic>
                         <pic:nvPicPr>
-                          <pic:cNvPr id="0" name="487db140260e4d2b.png"/>
+                          <pic:cNvPr id="0" name="91a07fbc861ddf6e.png"/>
                           <pic:cNvPicPr/>
                         </pic:nvPicPr>
                         <pic:blipFill>
@@ -22541,7 +22671,7 @@
                         <pic:spPr>
                           <a:xfrm>
                             <a:off x="0" y="0"/>
-                            <a:ext cx="4038656" cy="871326"/>
+                            <a:ext cx="4038656" cy="1509930"/>
                           </a:xfrm>
                           <a:prstGeom prst="rect"/>
                         </pic:spPr>
@@ -22563,7 +22693,7 @@
               </w:rPr>
               <w:drawing>
                 <wp:inline>
-                  <wp:extent cx="1705356" cy="1348740"/>
+                  <wp:extent cx="1842516" cy="1348740"/>
                   <wp:docPr id="11" name="Picture 11"/>
                   <wp:cNvGraphicFramePr>
                     <a:graphicFrameLocks noChangeAspect="1"/>
@@ -22572,7 +22702,7 @@
                     <a:graphicData uri="http://schemas.openxmlformats.org/drawingml/2006/picture">
                       <pic:pic>
                         <pic:nvPicPr>
-                          <pic:cNvPr id="0" name="168137401e6a1a47.png"/>
+                          <pic:cNvPr id="0" name="199847bc651e37de.png"/>
                           <pic:cNvPicPr/>
                         </pic:nvPicPr>
                         <pic:blipFill>
@@ -22584,7 +22714,7 @@
                         <pic:spPr>
                           <a:xfrm>
                             <a:off x="0" y="0"/>
-                            <a:ext cx="1705356" cy="1348740"/>
+                            <a:ext cx="1842516" cy="1348740"/>
                           </a:xfrm>
                           <a:prstGeom prst="rect"/>
                         </pic:spPr>

</xml_diff>